<commit_message>
Insert lab 2 screenshots including tasks 5 and 7
</commit_message>
<xml_diff>
--- a/lab2_450389.docx
+++ b/lab2_450389.docx
@@ -432,18 +432,43 @@
       <w:pPr>
         <w:pStyle w:val="Мойтекст"/>
         <w:keepNext/>
-        <w:spacing w:before="80" w:after="200"/>
-        <w:ind w:firstLine="0" w:left="0"/>
+        <w:spacing w:before="80" w:after="40"/>
+        <w:ind w:left="0" w:firstLine="0"/>
         <w:jc w:val="center"/>
-        <w:pBdr>
-          <w:top w:val="single" w:sz="4" w:color="B7B7B7"/>
-          <w:left w:val="single" w:sz="4" w:color="B7B7B7"/>
-          <w:bottom w:val="single" w:sz="4" w:color="B7B7B7"/>
-          <w:right w:val="single" w:sz="4" w:color="B7B7B7"/>
-        </w:pBdr>
       </w:pPr>
       <w:r>
-        <w:t>[Место для скриншота: Параметр WaitToKillAppTimeout со значением 2000]</w:t>
+        <w:drawing>
+          <wp:inline xmlns:a="http://schemas.openxmlformats.org/drawingml/2006/main" xmlns:pic="http://schemas.openxmlformats.org/drawingml/2006/picture">
+            <wp:extent cx="5688000" cy="2960327"/>
+            <wp:docPr id="1" name="Picture 1"/>
+            <wp:cNvGraphicFramePr>
+              <a:graphicFrameLocks noChangeAspect="1"/>
+            </wp:cNvGraphicFramePr>
+            <a:graphic>
+              <a:graphicData uri="http://schemas.openxmlformats.org/drawingml/2006/picture">
+                <pic:pic>
+                  <pic:nvPicPr>
+                    <pic:cNvPr id="0" name="0.png"/>
+                    <pic:cNvPicPr/>
+                  </pic:nvPicPr>
+                  <pic:blipFill>
+                    <a:blip r:embed="rId10"/>
+                    <a:stretch>
+                      <a:fillRect/>
+                    </a:stretch>
+                  </pic:blipFill>
+                  <pic:spPr>
+                    <a:xfrm>
+                      <a:off x="0" y="0"/>
+                      <a:ext cx="5688000" cy="2960327"/>
+                    </a:xfrm>
+                    <a:prstGeom prst="rect"/>
+                  </pic:spPr>
+                </pic:pic>
+              </a:graphicData>
+            </a:graphic>
+          </wp:inline>
+        </w:drawing>
       </w:r>
     </w:p>
     <w:p>
@@ -476,18 +501,43 @@
       <w:pPr>
         <w:pStyle w:val="Мойтекст"/>
         <w:keepNext/>
-        <w:spacing w:before="80" w:after="200"/>
-        <w:ind w:firstLine="0" w:left="0"/>
+        <w:spacing w:before="80" w:after="40"/>
+        <w:ind w:left="0" w:firstLine="0"/>
         <w:jc w:val="center"/>
-        <w:pBdr>
-          <w:top w:val="single" w:sz="4" w:color="B7B7B7"/>
-          <w:left w:val="single" w:sz="4" w:color="B7B7B7"/>
-          <w:bottom w:val="single" w:sz="4" w:color="B7B7B7"/>
-          <w:right w:val="single" w:sz="4" w:color="B7B7B7"/>
-        </w:pBdr>
       </w:pPr>
       <w:r>
-        <w:t>[Место для скриншота: Окно печати Блокнота при отключённом диспетчере печати]</w:t>
+        <w:drawing>
+          <wp:inline xmlns:a="http://schemas.openxmlformats.org/drawingml/2006/main" xmlns:pic="http://schemas.openxmlformats.org/drawingml/2006/picture">
+            <wp:extent cx="5688000" cy="3198203"/>
+            <wp:docPr id="2" name="Picture 2"/>
+            <wp:cNvGraphicFramePr>
+              <a:graphicFrameLocks noChangeAspect="1"/>
+            </wp:cNvGraphicFramePr>
+            <a:graphic>
+              <a:graphicData uri="http://schemas.openxmlformats.org/drawingml/2006/picture">
+                <pic:pic>
+                  <pic:nvPicPr>
+                    <pic:cNvPr id="0" name="2.png"/>
+                    <pic:cNvPicPr/>
+                  </pic:nvPicPr>
+                  <pic:blipFill>
+                    <a:blip r:embed="rId11"/>
+                    <a:stretch>
+                      <a:fillRect/>
+                    </a:stretch>
+                  </pic:blipFill>
+                  <pic:spPr>
+                    <a:xfrm>
+                      <a:off x="0" y="0"/>
+                      <a:ext cx="5688000" cy="3198203"/>
+                    </a:xfrm>
+                    <a:prstGeom prst="rect"/>
+                  </pic:spPr>
+                </pic:pic>
+              </a:graphicData>
+            </a:graphic>
+          </wp:inline>
+        </w:drawing>
       </w:r>
     </w:p>
     <w:p>
@@ -560,18 +610,43 @@
       <w:pPr>
         <w:pStyle w:val="Мойтекст"/>
         <w:keepNext/>
-        <w:spacing w:before="80" w:after="200"/>
-        <w:ind w:firstLine="0" w:left="0"/>
+        <w:spacing w:before="80" w:after="40"/>
+        <w:ind w:left="0" w:firstLine="0"/>
         <w:jc w:val="center"/>
-        <w:pBdr>
-          <w:top w:val="single" w:sz="4" w:color="B7B7B7"/>
-          <w:left w:val="single" w:sz="4" w:color="B7B7B7"/>
-          <w:bottom w:val="single" w:sz="4" w:color="B7B7B7"/>
-          <w:right w:val="single" w:sz="4" w:color="B7B7B7"/>
-        </w:pBdr>
       </w:pPr>
       <w:r>
-        <w:t>[Место для скриншота: MAC-адрес и IPv4-адрес Ethernet-адаптера]</w:t>
+        <w:drawing>
+          <wp:inline xmlns:a="http://schemas.openxmlformats.org/drawingml/2006/main" xmlns:pic="http://schemas.openxmlformats.org/drawingml/2006/picture">
+            <wp:extent cx="5688000" cy="2387725"/>
+            <wp:docPr id="3" name="Picture 3"/>
+            <wp:cNvGraphicFramePr>
+              <a:graphicFrameLocks noChangeAspect="1"/>
+            </wp:cNvGraphicFramePr>
+            <a:graphic>
+              <a:graphicData uri="http://schemas.openxmlformats.org/drawingml/2006/picture">
+                <pic:pic>
+                  <pic:nvPicPr>
+                    <pic:cNvPr id="0" name="3.png"/>
+                    <pic:cNvPicPr/>
+                  </pic:nvPicPr>
+                  <pic:blipFill>
+                    <a:blip r:embed="rId12"/>
+                    <a:stretch>
+                      <a:fillRect/>
+                    </a:stretch>
+                  </pic:blipFill>
+                  <pic:spPr>
+                    <a:xfrm>
+                      <a:off x="0" y="0"/>
+                      <a:ext cx="5688000" cy="2387725"/>
+                    </a:xfrm>
+                    <a:prstGeom prst="rect"/>
+                  </pic:spPr>
+                </pic:pic>
+              </a:graphicData>
+            </a:graphic>
+          </wp:inline>
+        </w:drawing>
       </w:r>
     </w:p>
     <w:p>
@@ -618,18 +693,43 @@
       <w:pPr>
         <w:pStyle w:val="Мойтекст"/>
         <w:keepNext/>
-        <w:spacing w:before="80" w:after="200"/>
-        <w:ind w:firstLine="0" w:left="0"/>
+        <w:spacing w:before="80" w:after="40"/>
+        <w:ind w:left="0" w:firstLine="0"/>
         <w:jc w:val="center"/>
-        <w:pBdr>
-          <w:top w:val="single" w:sz="4" w:color="B7B7B7"/>
-          <w:left w:val="single" w:sz="4" w:color="B7B7B7"/>
-          <w:bottom w:val="single" w:sz="4" w:color="B7B7B7"/>
-          <w:right w:val="single" w:sz="4" w:color="B7B7B7"/>
-        </w:pBdr>
       </w:pPr>
       <w:r>
-        <w:t>[Место для скриншота: Результат проверки sfc /verifyonly]</w:t>
+        <w:drawing>
+          <wp:inline xmlns:a="http://schemas.openxmlformats.org/drawingml/2006/main" xmlns:pic="http://schemas.openxmlformats.org/drawingml/2006/picture">
+            <wp:extent cx="5688000" cy="1004688"/>
+            <wp:docPr id="4" name="Picture 4"/>
+            <wp:cNvGraphicFramePr>
+              <a:graphicFrameLocks noChangeAspect="1"/>
+            </wp:cNvGraphicFramePr>
+            <a:graphic>
+              <a:graphicData uri="http://schemas.openxmlformats.org/drawingml/2006/picture">
+                <pic:pic>
+                  <pic:nvPicPr>
+                    <pic:cNvPr id="0" name="4.png"/>
+                    <pic:cNvPicPr/>
+                  </pic:nvPicPr>
+                  <pic:blipFill>
+                    <a:blip r:embed="rId13"/>
+                    <a:stretch>
+                      <a:fillRect/>
+                    </a:stretch>
+                  </pic:blipFill>
+                  <pic:spPr>
+                    <a:xfrm>
+                      <a:off x="0" y="0"/>
+                      <a:ext cx="5688000" cy="1004688"/>
+                    </a:xfrm>
+                    <a:prstGeom prst="rect"/>
+                  </pic:spPr>
+                </pic:pic>
+              </a:graphicData>
+            </a:graphic>
+          </wp:inline>
+        </w:drawing>
       </w:r>
     </w:p>
     <w:p>
@@ -652,18 +752,43 @@
       <w:pPr>
         <w:pStyle w:val="Мойтекст"/>
         <w:keepNext/>
-        <w:spacing w:before="80" w:after="200"/>
-        <w:ind w:firstLine="0" w:left="0"/>
+        <w:spacing w:before="80" w:after="40"/>
+        <w:ind w:left="0" w:firstLine="0"/>
         <w:jc w:val="center"/>
-        <w:pBdr>
-          <w:top w:val="single" w:sz="4" w:color="B7B7B7"/>
-          <w:left w:val="single" w:sz="4" w:color="B7B7B7"/>
-          <w:bottom w:val="single" w:sz="4" w:color="B7B7B7"/>
-          <w:right w:val="single" w:sz="4" w:color="B7B7B7"/>
-        </w:pBdr>
       </w:pPr>
       <w:r>
-        <w:t>[Место для скриншота: Начало журнала CBS.log]</w:t>
+        <w:drawing>
+          <wp:inline xmlns:a="http://schemas.openxmlformats.org/drawingml/2006/main" xmlns:pic="http://schemas.openxmlformats.org/drawingml/2006/picture">
+            <wp:extent cx="5688000" cy="2593239"/>
+            <wp:docPr id="5" name="Picture 5"/>
+            <wp:cNvGraphicFramePr>
+              <a:graphicFrameLocks noChangeAspect="1"/>
+            </wp:cNvGraphicFramePr>
+            <a:graphic>
+              <a:graphicData uri="http://schemas.openxmlformats.org/drawingml/2006/picture">
+                <pic:pic>
+                  <pic:nvPicPr>
+                    <pic:cNvPr id="0" name="5.png"/>
+                    <pic:cNvPicPr/>
+                  </pic:nvPicPr>
+                  <pic:blipFill>
+                    <a:blip r:embed="rId14"/>
+                    <a:stretch>
+                      <a:fillRect/>
+                    </a:stretch>
+                  </pic:blipFill>
+                  <pic:spPr>
+                    <a:xfrm>
+                      <a:off x="0" y="0"/>
+                      <a:ext cx="5688000" cy="2593239"/>
+                    </a:xfrm>
+                    <a:prstGeom prst="rect"/>
+                  </pic:spPr>
+                </pic:pic>
+              </a:graphicData>
+            </a:graphic>
+          </wp:inline>
+        </w:drawing>
       </w:r>
     </w:p>
     <w:p>
@@ -696,18 +821,43 @@
       <w:pPr>
         <w:pStyle w:val="Мойтекст"/>
         <w:keepNext/>
-        <w:spacing w:before="80" w:after="200"/>
-        <w:ind w:firstLine="0" w:left="0"/>
+        <w:spacing w:before="80" w:after="40"/>
+        <w:ind w:left="0" w:firstLine="0"/>
         <w:jc w:val="center"/>
-        <w:pBdr>
-          <w:top w:val="single" w:sz="4" w:color="B7B7B7"/>
-          <w:left w:val="single" w:sz="4" w:color="B7B7B7"/>
-          <w:bottom w:val="single" w:sz="4" w:color="B7B7B7"/>
-          <w:right w:val="single" w:sz="4" w:color="B7B7B7"/>
-        </w:pBdr>
       </w:pPr>
       <w:r>
-        <w:t>[Место для скриншота: Список приложений автозагрузки до изменения]</w:t>
+        <w:drawing>
+          <wp:inline xmlns:a="http://schemas.openxmlformats.org/drawingml/2006/main" xmlns:pic="http://schemas.openxmlformats.org/drawingml/2006/picture">
+            <wp:extent cx="5688000" cy="5147560"/>
+            <wp:docPr id="6" name="Picture 6"/>
+            <wp:cNvGraphicFramePr>
+              <a:graphicFrameLocks noChangeAspect="1"/>
+            </wp:cNvGraphicFramePr>
+            <a:graphic>
+              <a:graphicData uri="http://schemas.openxmlformats.org/drawingml/2006/picture">
+                <pic:pic>
+                  <pic:nvPicPr>
+                    <pic:cNvPr id="0" name="6.png"/>
+                    <pic:cNvPicPr/>
+                  </pic:nvPicPr>
+                  <pic:blipFill>
+                    <a:blip r:embed="rId15"/>
+                    <a:stretch>
+                      <a:fillRect/>
+                    </a:stretch>
+                  </pic:blipFill>
+                  <pic:spPr>
+                    <a:xfrm>
+                      <a:off x="0" y="0"/>
+                      <a:ext cx="5688000" cy="5147560"/>
+                    </a:xfrm>
+                    <a:prstGeom prst="rect"/>
+                  </pic:spPr>
+                </pic:pic>
+              </a:graphicData>
+            </a:graphic>
+          </wp:inline>
+        </w:drawing>
       </w:r>
     </w:p>
     <w:p>
@@ -730,18 +880,43 @@
       <w:pPr>
         <w:pStyle w:val="Мойтекст"/>
         <w:keepNext/>
-        <w:spacing w:before="80" w:after="200"/>
-        <w:ind w:firstLine="0" w:left="0"/>
+        <w:spacing w:before="80" w:after="40"/>
+        <w:ind w:left="0" w:firstLine="0"/>
         <w:jc w:val="center"/>
-        <w:pBdr>
-          <w:top w:val="single" w:sz="4" w:color="B7B7B7"/>
-          <w:left w:val="single" w:sz="4" w:color="B7B7B7"/>
-          <w:bottom w:val="single" w:sz="4" w:color="B7B7B7"/>
-          <w:right w:val="single" w:sz="4" w:color="B7B7B7"/>
-        </w:pBdr>
       </w:pPr>
       <w:r>
-        <w:t>[Место для скриншота: Отключённый элемент автозагрузки msedge]</w:t>
+        <w:drawing>
+          <wp:inline xmlns:a="http://schemas.openxmlformats.org/drawingml/2006/main" xmlns:pic="http://schemas.openxmlformats.org/drawingml/2006/picture">
+            <wp:extent cx="5688000" cy="5149081"/>
+            <wp:docPr id="7" name="Picture 7"/>
+            <wp:cNvGraphicFramePr>
+              <a:graphicFrameLocks noChangeAspect="1"/>
+            </wp:cNvGraphicFramePr>
+            <a:graphic>
+              <a:graphicData uri="http://schemas.openxmlformats.org/drawingml/2006/picture">
+                <pic:pic>
+                  <pic:nvPicPr>
+                    <pic:cNvPr id="0" name="7.png"/>
+                    <pic:cNvPicPr/>
+                  </pic:nvPicPr>
+                  <pic:blipFill>
+                    <a:blip r:embed="rId16"/>
+                    <a:stretch>
+                      <a:fillRect/>
+                    </a:stretch>
+                  </pic:blipFill>
+                  <pic:spPr>
+                    <a:xfrm>
+                      <a:off x="0" y="0"/>
+                      <a:ext cx="5688000" cy="5149081"/>
+                    </a:xfrm>
+                    <a:prstGeom prst="rect"/>
+                  </pic:spPr>
+                </pic:pic>
+              </a:graphicData>
+            </a:graphic>
+          </wp:inline>
+        </w:drawing>
       </w:r>
     </w:p>
     <w:p>
@@ -767,7 +942,7 @@
         <w:pStyle w:val="Мойтекст"/>
       </w:pPr>
       <w:r>
-        <w:t>В FAR Manager используется каталог F:\Садовщикова\LAB2. Создание папок выполняется клавишей F7, вход в выделенную папку — Enter. Внутри LAB2 предусмотрена папка 450389, соответствующая номеру ИСУ, а также каталоги дистрибутивов, программ и отчётов.</w:t>
+        <w:t>В FAR Manager используется каталог F:\Садовщикова\LAB2. Создание папок выполняется клавишей F7, вход в выделенную папку — Enter. Внутри LAB2 создаётся папка 450389, соответствующая номеру ИСУ, а также каталоги дистрибутивов, программ и отчётов. На скриншоте показан диалог создания каталога 450389.</w:t>
       </w:r>
     </w:p>
     <w:p>
@@ -808,18 +983,43 @@
       <w:pPr>
         <w:pStyle w:val="Мойтекст"/>
         <w:keepNext/>
-        <w:spacing w:before="80" w:after="3402"/>
-        <w:ind w:firstLine="0" w:left="0"/>
+        <w:spacing w:before="80" w:after="40"/>
+        <w:ind w:left="0" w:firstLine="0"/>
         <w:jc w:val="center"/>
-        <w:pBdr>
-          <w:top w:val="single" w:sz="4" w:color="B7B7B7"/>
-          <w:left w:val="single" w:sz="4" w:color="B7B7B7"/>
-          <w:bottom w:val="single" w:sz="4" w:color="B7B7B7"/>
-          <w:right w:val="single" w:sz="4" w:color="B7B7B7"/>
-        </w:pBdr>
       </w:pPr>
       <w:r>
-        <w:t>[Место для скриншота: Диалог создания папки 450389 в FAR]</w:t>
+        <w:drawing>
+          <wp:inline xmlns:a="http://schemas.openxmlformats.org/drawingml/2006/main" xmlns:pic="http://schemas.openxmlformats.org/drawingml/2006/picture">
+            <wp:extent cx="5688000" cy="3183270"/>
+            <wp:docPr id="8" name="Picture 8"/>
+            <wp:cNvGraphicFramePr>
+              <a:graphicFrameLocks noChangeAspect="1"/>
+            </wp:cNvGraphicFramePr>
+            <a:graphic>
+              <a:graphicData uri="http://schemas.openxmlformats.org/drawingml/2006/picture">
+                <pic:pic>
+                  <pic:nvPicPr>
+                    <pic:cNvPr id="0" name="8.png"/>
+                    <pic:cNvPicPr/>
+                  </pic:nvPicPr>
+                  <pic:blipFill>
+                    <a:blip r:embed="rId17"/>
+                    <a:stretch>
+                      <a:fillRect/>
+                    </a:stretch>
+                  </pic:blipFill>
+                  <pic:spPr>
+                    <a:xfrm>
+                      <a:off x="0" y="0"/>
+                      <a:ext cx="5688000" cy="3183270"/>
+                    </a:xfrm>
+                    <a:prstGeom prst="rect"/>
+                  </pic:spPr>
+                </pic:pic>
+              </a:graphicData>
+            </a:graphic>
+          </wp:inline>
+        </w:drawing>
       </w:r>
     </w:p>
     <w:p>
@@ -852,18 +1052,43 @@
       <w:pPr>
         <w:pStyle w:val="Мойтекст"/>
         <w:keepNext/>
-        <w:spacing w:before="80" w:after="200"/>
-        <w:ind w:firstLine="0" w:left="0"/>
+        <w:spacing w:before="80" w:after="40"/>
+        <w:ind w:left="0" w:firstLine="0"/>
         <w:jc w:val="center"/>
-        <w:pBdr>
-          <w:top w:val="single" w:sz="4" w:color="B7B7B7"/>
-          <w:left w:val="single" w:sz="4" w:color="B7B7B7"/>
-          <w:bottom w:val="single" w:sz="4" w:color="B7B7B7"/>
-          <w:right w:val="single" w:sz="4" w:color="B7B7B7"/>
-        </w:pBdr>
       </w:pPr>
       <w:r>
-        <w:t>[Место для скриншота: Диалог распаковки FAR в PROGRAMS\FARportable]</w:t>
+        <w:drawing>
+          <wp:inline xmlns:a="http://schemas.openxmlformats.org/drawingml/2006/main" xmlns:pic="http://schemas.openxmlformats.org/drawingml/2006/picture">
+            <wp:extent cx="5688000" cy="3101183"/>
+            <wp:docPr id="9" name="Picture 9"/>
+            <wp:cNvGraphicFramePr>
+              <a:graphicFrameLocks noChangeAspect="1"/>
+            </wp:cNvGraphicFramePr>
+            <a:graphic>
+              <a:graphicData uri="http://schemas.openxmlformats.org/drawingml/2006/picture">
+                <pic:pic>
+                  <pic:nvPicPr>
+                    <pic:cNvPr id="0" name="9.png"/>
+                    <pic:cNvPicPr/>
+                  </pic:nvPicPr>
+                  <pic:blipFill>
+                    <a:blip r:embed="rId18"/>
+                    <a:stretch>
+                      <a:fillRect/>
+                    </a:stretch>
+                  </pic:blipFill>
+                  <pic:spPr>
+                    <a:xfrm>
+                      <a:off x="0" y="0"/>
+                      <a:ext cx="5688000" cy="3101183"/>
+                    </a:xfrm>
+                    <a:prstGeom prst="rect"/>
+                  </pic:spPr>
+                </pic:pic>
+              </a:graphicData>
+            </a:graphic>
+          </wp:inline>
+        </w:drawing>
       </w:r>
     </w:p>
     <w:p>
@@ -886,18 +1111,43 @@
       <w:pPr>
         <w:pStyle w:val="Мойтекст"/>
         <w:keepNext/>
-        <w:spacing w:before="80" w:after="200"/>
-        <w:ind w:firstLine="0" w:left="0"/>
+        <w:spacing w:before="80" w:after="40"/>
+        <w:ind w:left="0" w:firstLine="0"/>
         <w:jc w:val="center"/>
-        <w:pBdr>
-          <w:top w:val="single" w:sz="4" w:color="B7B7B7"/>
-          <w:left w:val="single" w:sz="4" w:color="B7B7B7"/>
-          <w:bottom w:val="single" w:sz="4" w:color="B7B7B7"/>
-          <w:right w:val="single" w:sz="4" w:color="B7B7B7"/>
-        </w:pBdr>
       </w:pPr>
       <w:r>
-        <w:t>[Место для скриншота: Диалог извлечения архива FRsetup.7z]</w:t>
+        <w:drawing>
+          <wp:inline xmlns:a="http://schemas.openxmlformats.org/drawingml/2006/main" xmlns:pic="http://schemas.openxmlformats.org/drawingml/2006/picture">
+            <wp:extent cx="5688000" cy="3202058"/>
+            <wp:docPr id="10" name="Picture 10"/>
+            <wp:cNvGraphicFramePr>
+              <a:graphicFrameLocks noChangeAspect="1"/>
+            </wp:cNvGraphicFramePr>
+            <a:graphic>
+              <a:graphicData uri="http://schemas.openxmlformats.org/drawingml/2006/picture">
+                <pic:pic>
+                  <pic:nvPicPr>
+                    <pic:cNvPr id="0" name="10.png"/>
+                    <pic:cNvPicPr/>
+                  </pic:nvPicPr>
+                  <pic:blipFill>
+                    <a:blip r:embed="rId19"/>
+                    <a:stretch>
+                      <a:fillRect/>
+                    </a:stretch>
+                  </pic:blipFill>
+                  <pic:spPr>
+                    <a:xfrm>
+                      <a:off x="0" y="0"/>
+                      <a:ext cx="5688000" cy="3202058"/>
+                    </a:xfrm>
+                    <a:prstGeom prst="rect"/>
+                  </pic:spPr>
+                </pic:pic>
+              </a:graphicData>
+            </a:graphic>
+          </wp:inline>
+        </w:drawing>
       </w:r>
     </w:p>
     <w:p>
@@ -923,25 +1173,50 @@
         <w:pStyle w:val="Мойтекст"/>
       </w:pPr>
       <w:r>
-        <w:t>По условию FineReader устанавливается в F:\Садовщикова\LAB2\PROGRAMS\FineReader. Первый снимок предназначен для содержимого каталога сразу после установки. Удаление выполняется штатным мастером удаления программы, после чего содержимое каталога повторно открывается в FAR и обновляется сочетанием Ctrl + R.</w:t>
+        <w:t>По условию FineReader устанавливается в F:\Садовщикова\LAB2\PROGRAMS\FineReader, затем удаляется с помощью штатного мастера удаления. На первом предоставленном снимке показан каталог FineReader с файлами, на втором — пустой каталог после удаления. Оба снимка сделаны в Проводнике Windows; по условию содержимое каталога требуется показать в FAR.</w:t>
       </w:r>
     </w:p>
     <w:p>
       <w:pPr>
         <w:pStyle w:val="Мойтекст"/>
         <w:keepNext/>
-        <w:spacing w:before="80" w:after="3402"/>
-        <w:ind w:firstLine="0" w:left="0"/>
+        <w:spacing w:before="80" w:after="40"/>
+        <w:ind w:left="0" w:firstLine="0"/>
         <w:jc w:val="center"/>
-        <w:pBdr>
-          <w:top w:val="single" w:sz="4" w:color="B7B7B7"/>
-          <w:left w:val="single" w:sz="4" w:color="B7B7B7"/>
-          <w:bottom w:val="single" w:sz="4" w:color="B7B7B7"/>
-          <w:right w:val="single" w:sz="4" w:color="B7B7B7"/>
-        </w:pBdr>
       </w:pPr>
       <w:r>
-        <w:t>[Место для скриншота: Каталог PROGRAMS\FineReader после установки]</w:t>
+        <w:drawing>
+          <wp:inline xmlns:a="http://schemas.openxmlformats.org/drawingml/2006/main" xmlns:pic="http://schemas.openxmlformats.org/drawingml/2006/picture">
+            <wp:extent cx="5688000" cy="3167370"/>
+            <wp:docPr id="11" name="Picture 11"/>
+            <wp:cNvGraphicFramePr>
+              <a:graphicFrameLocks noChangeAspect="1"/>
+            </wp:cNvGraphicFramePr>
+            <a:graphic>
+              <a:graphicData uri="http://schemas.openxmlformats.org/drawingml/2006/picture">
+                <pic:pic>
+                  <pic:nvPicPr>
+                    <pic:cNvPr id="0" name="11.png"/>
+                    <pic:cNvPicPr/>
+                  </pic:nvPicPr>
+                  <pic:blipFill>
+                    <a:blip r:embed="rId20"/>
+                    <a:stretch>
+                      <a:fillRect/>
+                    </a:stretch>
+                  </pic:blipFill>
+                  <pic:spPr>
+                    <a:xfrm>
+                      <a:off x="0" y="0"/>
+                      <a:ext cx="5688000" cy="3167370"/>
+                    </a:xfrm>
+                    <a:prstGeom prst="rect"/>
+                  </pic:spPr>
+                </pic:pic>
+              </a:graphicData>
+            </a:graphic>
+          </wp:inline>
+        </w:drawing>
       </w:r>
     </w:p>
     <w:p>
@@ -956,18 +1231,43 @@
       <w:pPr>
         <w:pStyle w:val="Мойтекст"/>
         <w:keepNext/>
-        <w:spacing w:before="80" w:after="3402"/>
-        <w:ind w:firstLine="0" w:left="0"/>
+        <w:spacing w:before="80" w:after="40"/>
+        <w:ind w:left="0" w:firstLine="0"/>
         <w:jc w:val="center"/>
-        <w:pBdr>
-          <w:top w:val="single" w:sz="4" w:color="B7B7B7"/>
-          <w:left w:val="single" w:sz="4" w:color="B7B7B7"/>
-          <w:bottom w:val="single" w:sz="4" w:color="B7B7B7"/>
-          <w:right w:val="single" w:sz="4" w:color="B7B7B7"/>
-        </w:pBdr>
       </w:pPr>
       <w:r>
-        <w:t>[Место для скриншота: Каталог PROGRAMS\FineReader после удаления]</w:t>
+        <w:drawing>
+          <wp:inline xmlns:a="http://schemas.openxmlformats.org/drawingml/2006/main" xmlns:pic="http://schemas.openxmlformats.org/drawingml/2006/picture">
+            <wp:extent cx="5688000" cy="3226335"/>
+            <wp:docPr id="12" name="Picture 12"/>
+            <wp:cNvGraphicFramePr>
+              <a:graphicFrameLocks noChangeAspect="1"/>
+            </wp:cNvGraphicFramePr>
+            <a:graphic>
+              <a:graphicData uri="http://schemas.openxmlformats.org/drawingml/2006/picture">
+                <pic:pic>
+                  <pic:nvPicPr>
+                    <pic:cNvPr id="0" name="12.png"/>
+                    <pic:cNvPicPr/>
+                  </pic:nvPicPr>
+                  <pic:blipFill>
+                    <a:blip r:embed="rId21"/>
+                    <a:stretch>
+                      <a:fillRect/>
+                    </a:stretch>
+                  </pic:blipFill>
+                  <pic:spPr>
+                    <a:xfrm>
+                      <a:off x="0" y="0"/>
+                      <a:ext cx="5688000" cy="3226335"/>
+                    </a:xfrm>
+                    <a:prstGeom prst="rect"/>
+                  </pic:spPr>
+                </pic:pic>
+              </a:graphicData>
+            </a:graphic>
+          </wp:inline>
+        </w:drawing>
       </w:r>
     </w:p>
     <w:p>
@@ -1022,18 +1322,43 @@
       <w:pPr>
         <w:pStyle w:val="Мойтекст"/>
         <w:keepNext/>
-        <w:spacing w:before="80" w:after="200"/>
-        <w:ind w:firstLine="0" w:left="0"/>
+        <w:spacing w:before="80" w:after="40"/>
+        <w:ind w:left="0" w:firstLine="0"/>
         <w:jc w:val="center"/>
-        <w:pBdr>
-          <w:top w:val="single" w:sz="4" w:color="B7B7B7"/>
-          <w:left w:val="single" w:sz="4" w:color="B7B7B7"/>
-          <w:bottom w:val="single" w:sz="4" w:color="B7B7B7"/>
-          <w:right w:val="single" w:sz="4" w:color="B7B7B7"/>
-        </w:pBdr>
       </w:pPr>
       <w:r>
-        <w:t>[Место для скриншота: Запуск FAR по имени после изменения PATH]</w:t>
+        <w:drawing>
+          <wp:inline xmlns:a="http://schemas.openxmlformats.org/drawingml/2006/main" xmlns:pic="http://schemas.openxmlformats.org/drawingml/2006/picture">
+            <wp:extent cx="5688000" cy="3275503"/>
+            <wp:docPr id="13" name="Picture 13"/>
+            <wp:cNvGraphicFramePr>
+              <a:graphicFrameLocks noChangeAspect="1"/>
+            </wp:cNvGraphicFramePr>
+            <a:graphic>
+              <a:graphicData uri="http://schemas.openxmlformats.org/drawingml/2006/picture">
+                <pic:pic>
+                  <pic:nvPicPr>
+                    <pic:cNvPr id="0" name="13.png"/>
+                    <pic:cNvPicPr/>
+                  </pic:nvPicPr>
+                  <pic:blipFill>
+                    <a:blip r:embed="rId22"/>
+                    <a:stretch>
+                      <a:fillRect/>
+                    </a:stretch>
+                  </pic:blipFill>
+                  <pic:spPr>
+                    <a:xfrm>
+                      <a:off x="0" y="0"/>
+                      <a:ext cx="5688000" cy="3275503"/>
+                    </a:xfrm>
+                    <a:prstGeom prst="rect"/>
+                  </pic:spPr>
+                </pic:pic>
+              </a:graphicData>
+            </a:graphic>
+          </wp:inline>
+        </w:drawing>
       </w:r>
     </w:p>
     <w:p>
@@ -1066,18 +1391,43 @@
       <w:pPr>
         <w:pStyle w:val="Мойтекст"/>
         <w:keepNext/>
-        <w:spacing w:before="80" w:after="200"/>
-        <w:ind w:firstLine="0" w:left="0"/>
+        <w:spacing w:before="80" w:after="40"/>
+        <w:ind w:left="0" w:firstLine="0"/>
         <w:jc w:val="center"/>
-        <w:pBdr>
-          <w:top w:val="single" w:sz="4" w:color="B7B7B7"/>
-          <w:left w:val="single" w:sz="4" w:color="B7B7B7"/>
-          <w:bottom w:val="single" w:sz="4" w:color="B7B7B7"/>
-          <w:right w:val="single" w:sz="4" w:color="B7B7B7"/>
-        </w:pBdr>
       </w:pPr>
       <w:r>
-        <w:t>[Место для скриншота: Временная панель результатов поиска *notepad*]</w:t>
+        <w:drawing>
+          <wp:inline xmlns:a="http://schemas.openxmlformats.org/drawingml/2006/main" xmlns:pic="http://schemas.openxmlformats.org/drawingml/2006/picture">
+            <wp:extent cx="5148635" cy="5399999"/>
+            <wp:docPr id="14" name="Picture 14"/>
+            <wp:cNvGraphicFramePr>
+              <a:graphicFrameLocks noChangeAspect="1"/>
+            </wp:cNvGraphicFramePr>
+            <a:graphic>
+              <a:graphicData uri="http://schemas.openxmlformats.org/drawingml/2006/picture">
+                <pic:pic>
+                  <pic:nvPicPr>
+                    <pic:cNvPr id="0" name="14.png"/>
+                    <pic:cNvPicPr/>
+                  </pic:nvPicPr>
+                  <pic:blipFill>
+                    <a:blip r:embed="rId23"/>
+                    <a:stretch>
+                      <a:fillRect/>
+                    </a:stretch>
+                  </pic:blipFill>
+                  <pic:spPr>
+                    <a:xfrm>
+                      <a:off x="0" y="0"/>
+                      <a:ext cx="5148635" cy="5399999"/>
+                    </a:xfrm>
+                    <a:prstGeom prst="rect"/>
+                  </pic:spPr>
+                </pic:pic>
+              </a:graphicData>
+            </a:graphic>
+          </wp:inline>
+        </w:drawing>
       </w:r>
     </w:p>
     <w:p>
@@ -1172,18 +1522,43 @@
       <w:pPr>
         <w:pStyle w:val="Мойтекст"/>
         <w:keepNext/>
-        <w:spacing w:before="80" w:after="200"/>
-        <w:ind w:firstLine="0" w:left="0"/>
+        <w:spacing w:before="80" w:after="40"/>
+        <w:ind w:left="0" w:firstLine="0"/>
         <w:jc w:val="center"/>
-        <w:pBdr>
-          <w:top w:val="single" w:sz="4" w:color="B7B7B7"/>
-          <w:left w:val="single" w:sz="4" w:color="B7B7B7"/>
-          <w:bottom w:val="single" w:sz="4" w:color="B7B7B7"/>
-          <w:right w:val="single" w:sz="4" w:color="B7B7B7"/>
-        </w:pBdr>
       </w:pPr>
       <w:r>
-        <w:t>[Место для скриншота: Файл tree.txt в редакторе FAR, кодировка UTF-8]</w:t>
+        <w:drawing>
+          <wp:inline xmlns:a="http://schemas.openxmlformats.org/drawingml/2006/main" xmlns:pic="http://schemas.openxmlformats.org/drawingml/2006/picture">
+            <wp:extent cx="5688000" cy="3189311"/>
+            <wp:docPr id="15" name="Picture 15"/>
+            <wp:cNvGraphicFramePr>
+              <a:graphicFrameLocks noChangeAspect="1"/>
+            </wp:cNvGraphicFramePr>
+            <a:graphic>
+              <a:graphicData uri="http://schemas.openxmlformats.org/drawingml/2006/picture">
+                <pic:pic>
+                  <pic:nvPicPr>
+                    <pic:cNvPr id="0" name="1.png"/>
+                    <pic:cNvPicPr/>
+                  </pic:nvPicPr>
+                  <pic:blipFill>
+                    <a:blip r:embed="rId24"/>
+                    <a:stretch>
+                      <a:fillRect/>
+                    </a:stretch>
+                  </pic:blipFill>
+                  <pic:spPr>
+                    <a:xfrm>
+                      <a:off x="0" y="0"/>
+                      <a:ext cx="5688000" cy="3189311"/>
+                    </a:xfrm>
+                    <a:prstGeom prst="rect"/>
+                  </pic:spPr>
+                </pic:pic>
+              </a:graphicData>
+            </a:graphic>
+          </wp:inline>
+        </w:drawing>
       </w:r>
     </w:p>
     <w:p>

</xml_diff>

<commit_message>
Update FineReader extraction and directory tree evidence
</commit_message>
<xml_diff>
--- a/lab2_450389.docx
+++ b/lab2_450389.docx
@@ -1104,7 +1104,7 @@
         <w:pStyle w:val="Мойтекст"/>
       </w:pPr>
       <w:r>
-        <w:t>Для архива FRsetup.7z по условию требуется распаковка в тот же каталог LAB2\DISTRIBUTIVES\FineReader. На присланном снимке исходный архив находится в этом каталоге, однако в поле назначения указано LAB2\PROGRAMS\FARportable. Этот снимок показывает открытый диалог извлечения, но не подтверждает требуемое место распаковки FineReader.</w:t>
+        <w:t>Архив FRsetup.7z выбран в каталоге LAB2\DISTRIBUTIVES\FineReader. В диалоге Extract files указан этот же каталог назначения: F:\Садовщикова\LAB2\DISTRIBUTIVES\FineReader. После извлечения в нём появилась папка setup с файлами FineReader.z, readme.1st, setup.exe и start.bat, что также видно в обновлённом дереве каталогов.</w:t>
       </w:r>
     </w:p>
     <w:p>
@@ -1118,7 +1118,7 @@
       <w:r>
         <w:drawing>
           <wp:inline xmlns:a="http://schemas.openxmlformats.org/drawingml/2006/main" xmlns:pic="http://schemas.openxmlformats.org/drawingml/2006/picture">
-            <wp:extent cx="5688000" cy="3202058"/>
+            <wp:extent cx="5688000" cy="3045660"/>
             <wp:docPr id="10" name="Picture 10"/>
             <wp:cNvGraphicFramePr>
               <a:graphicFrameLocks noChangeAspect="1"/>
@@ -1139,7 +1139,7 @@
                   <pic:spPr>
                     <a:xfrm>
                       <a:off x="0" y="0"/>
-                      <a:ext cx="5688000" cy="3202058"/>
+                      <a:ext cx="5688000" cy="3045660"/>
                     </a:xfrm>
                     <a:prstGeom prst="rect"/>
                   </pic:spPr>
@@ -1499,7 +1499,7 @@
         <w:pStyle w:val="Мойтекст"/>
       </w:pPr>
       <w:r>
-        <w:t>Команда tree выводит структуру LAB2, ключ /F включает файлы, а /A использует обычные символы для ветвей дерева. Результат перенаправляется в файл LAB2\450389\tree.txt, который открыт в редакторе FAR клавишей F4 с кодировкой UTF-8.</w:t>
+        <w:t>Команда tree выводит структуру LAB2, ключ /F включает файлы, а /A использует обычные символы для ветвей дерева. Результат перенаправлен в файл LAB2\450389\tree.txt. Файл открыт в FAR; на скриншоте выбран режим ANSI, русское название каталога отображается корректно.</w:t>
       </w:r>
     </w:p>
     <w:p>
@@ -1513,8 +1513,6 @@
           <w:rFonts w:ascii="Courier New" w:hAnsi="Courier New"/>
           <w:sz w:val="16"/>
         </w:rPr>
-        <w:t>chcp 65001</w:t>
-        <w:br/>
         <w:t>tree "F:\Садовщикова\LAB2" /F /A &gt; "F:\Садовщикова\LAB2\450389\tree.txt"</w:t>
       </w:r>
     </w:p>
@@ -1529,7 +1527,7 @@
       <w:r>
         <w:drawing>
           <wp:inline xmlns:a="http://schemas.openxmlformats.org/drawingml/2006/main" xmlns:pic="http://schemas.openxmlformats.org/drawingml/2006/picture">
-            <wp:extent cx="5688000" cy="3189311"/>
+            <wp:extent cx="5688000" cy="3057300"/>
             <wp:docPr id="15" name="Picture 15"/>
             <wp:cNvGraphicFramePr>
               <a:graphicFrameLocks noChangeAspect="1"/>
@@ -1550,7 +1548,7 @@
                   <pic:spPr>
                     <a:xfrm>
                       <a:off x="0" y="0"/>
-                      <a:ext cx="5688000" cy="3189311"/>
+                      <a:ext cx="5688000" cy="3057300"/>
                     </a:xfrm>
                     <a:prstGeom prst="rect"/>
                   </pic:spPr>
@@ -1566,7 +1564,7 @@
         <w:pStyle w:val="Мояподпись"/>
       </w:pPr>
       <w:r>
-        <w:t>Скриншот 15 — Файл tree.txt в редакторе FAR, кодировка UTF-8</w:t>
+        <w:t>Скриншот 15 — Файл tree.txt, открытый в FAR</w:t>
       </w:r>
     </w:p>
     <w:p>
@@ -1574,7 +1572,7 @@
         <w:pStyle w:val="Мойтекст"/>
       </w:pPr>
       <w:r>
-        <w:t>В открытом файле видны каталог 450389, каталоги дистрибутивов и программ, архив FAR и файлы распакованной версии FAR. Заголовок Folder PATH listing является английским вариантом заголовка утилиты tree и не указывает на ошибку кодировки.</w:t>
+        <w:t>В открытом файле видны каталог 450389, архивы дистрибутивов, папка DISTRIBUTIVES\FineReader\setup с распакованными установочными файлами и каталог PROGRAMS\FARportable с файлами FAR. Заголовок Folder PATH listing является английским вариантом заголовка утилиты tree и не указывает на ошибку кодировки.</w:t>
       </w:r>
     </w:p>
     <w:p>

</xml_diff>

<commit_message>
Replace task 7 screenshots with FAR views before and after removal
</commit_message>
<xml_diff>
--- a/lab2_450389.docx
+++ b/lab2_450389.docx
@@ -1173,7 +1173,7 @@
         <w:pStyle w:val="Мойтекст"/>
       </w:pPr>
       <w:r>
-        <w:t>По условию FineReader устанавливается в F:\Садовщикова\LAB2\PROGRAMS\FineReader, затем удаляется с помощью штатного мастера удаления. На первом предоставленном снимке показан каталог FineReader с файлами, на втором — пустой каталог после удаления. Оба снимка сделаны в Проводнике Windows; по условию содержимое каталога требуется показать в FAR.</w:t>
+        <w:t>FineReader установлен в F:\Садовщикова\LAB2\PROGRAMS\FineReader. На первом скриншоте каталог открыт в FAR: видны FineReader.exe, setup.exe, start.bat, языковые и дополнительные компоненты. После удаления программы с помощью штатного мастера содержимое каталога повторно открыто в FAR. На втором скриншоте основной исполняемый файл и компоненты программы отсутствуют; в каталоге остался setup.exe. Таким образом, после удаления программы каталог не обязательно становится пустым: установочный файл может сохраняться.</w:t>
       </w:r>
     </w:p>
     <w:p>
@@ -1187,7 +1187,7 @@
       <w:r>
         <w:drawing>
           <wp:inline xmlns:a="http://schemas.openxmlformats.org/drawingml/2006/main" xmlns:pic="http://schemas.openxmlformats.org/drawingml/2006/picture">
-            <wp:extent cx="5688000" cy="3167370"/>
+            <wp:extent cx="5688000" cy="3059792"/>
             <wp:docPr id="11" name="Picture 11"/>
             <wp:cNvGraphicFramePr>
               <a:graphicFrameLocks noChangeAspect="1"/>
@@ -1208,7 +1208,7 @@
                   <pic:spPr>
                     <a:xfrm>
                       <a:off x="0" y="0"/>
-                      <a:ext cx="5688000" cy="3167370"/>
+                      <a:ext cx="5688000" cy="3059792"/>
                     </a:xfrm>
                     <a:prstGeom prst="rect"/>
                   </pic:spPr>
@@ -1238,7 +1238,7 @@
       <w:r>
         <w:drawing>
           <wp:inline xmlns:a="http://schemas.openxmlformats.org/drawingml/2006/main" xmlns:pic="http://schemas.openxmlformats.org/drawingml/2006/picture">
-            <wp:extent cx="5688000" cy="3226335"/>
+            <wp:extent cx="5688000" cy="3048625"/>
             <wp:docPr id="12" name="Picture 12"/>
             <wp:cNvGraphicFramePr>
               <a:graphicFrameLocks noChangeAspect="1"/>
@@ -1259,7 +1259,7 @@
                   <pic:spPr>
                     <a:xfrm>
                       <a:off x="0" y="0"/>
-                      <a:ext cx="5688000" cy="3226335"/>
+                      <a:ext cx="5688000" cy="3048625"/>
                     </a:xfrm>
                     <a:prstGeom prst="rect"/>
                   </pic:spPr>

</xml_diff>